<commit_message>
Valori OMI in tabella Word, dopo la metratura commerciale
- i valori OMI letti dal sito (zona, semestre, valori di mercato e locazione per
  destinazione) diventano una tabella Word con il logo dell'Agenzia delle Entrate
  e la fonte; la schermata resta in 03_OMI e si usa solo se la lettura non riesce
- la tabella va dopo le pertinenze e prima dei calcoli, che iniziano su pagina nuova
- logo preso dal sito OMI o caricabile dalle impostazioni
- il modello sul NAS si aggiorna col programma se nessuno l'ha modificato

Co-Authored-By: Claude Opus 5.5 <noreply@anthropic.com>
Claude-Session: https://claude.ai/code/session_01GFqWfsVatsLJvctcKSGrA2
</commit_message>
<xml_diff>
--- a/valutazioni/modelli/valutazione_modello.docx
+++ b/valutazioni/modelli/valutazione_modello.docx
@@ -1097,96 +1097,6 @@
     </w:p>
     <w:p>
       <w:pPr>
-        <w:spacing w:line="360" w:lineRule="auto"/>
-        <w:jc w:val="both"/>
-        <w:rPr>
-          <w:rFonts w:ascii="Avenir Next LT Pro Light" w:hAnsi="Avenir Next LT Pro Light" w:cstheme="minorHAnsi"/>
-          <w:bCs/>
-        </w:rPr>
-      </w:pPr>
-    </w:p>
-    <w:p>
-      <w:pPr>
-        <w:spacing w:line="360" w:lineRule="auto"/>
-        <w:jc w:val="both"/>
-        <w:rPr>
-          <w:rFonts w:ascii="Avenir Next LT Pro Light" w:hAnsi="Avenir Next LT Pro Light" w:cstheme="minorHAnsi"/>
-          <w:bCs/>
-        </w:rPr>
-      </w:pPr>
-    </w:p>
-    <w:p>
-      <w:pPr>
-        <w:spacing w:line="360" w:lineRule="auto"/>
-        <w:jc w:val="both"/>
-        <w:rPr>
-          <w:rFonts w:ascii="Avenir Next LT Pro Light" w:hAnsi="Avenir Next LT Pro Light" w:cstheme="minorHAnsi"/>
-          <w:bCs/>
-        </w:rPr>
-      </w:pPr>
-    </w:p>
-    <w:p>
-      <w:pPr>
-        <w:spacing w:line="360" w:lineRule="auto"/>
-        <w:jc w:val="both"/>
-        <w:rPr>
-          <w:rFonts w:ascii="Avenir Next LT Pro Light" w:hAnsi="Avenir Next LT Pro Light" w:cstheme="minorHAnsi"/>
-          <w:bCs/>
-        </w:rPr>
-      </w:pPr>
-    </w:p>
-    <w:p>
-      <w:pPr>
-        <w:spacing w:line="360" w:lineRule="auto"/>
-        <w:jc w:val="both"/>
-        <w:rPr>
-          <w:rFonts w:ascii="Avenir Next LT Pro Light" w:hAnsi="Avenir Next LT Pro Light" w:cstheme="minorHAnsi"/>
-          <w:bCs/>
-        </w:rPr>
-      </w:pPr>
-    </w:p>
-    <w:p>
-      <w:pPr>
-        <w:spacing w:line="360" w:lineRule="auto"/>
-        <w:jc w:val="both"/>
-        <w:rPr>
-          <w:rFonts w:ascii="Avenir Next LT Pro Light" w:hAnsi="Avenir Next LT Pro Light" w:cstheme="minorHAnsi"/>
-          <w:bCs/>
-        </w:rPr>
-      </w:pPr>
-    </w:p>
-    <w:p>
-      <w:pPr>
-        <w:spacing w:line="360" w:lineRule="auto"/>
-        <w:jc w:val="both"/>
-        <w:rPr>
-          <w:rFonts w:ascii="Avenir Next LT Pro Light" w:hAnsi="Avenir Next LT Pro Light" w:cstheme="minorHAnsi"/>
-          <w:bCs/>
-        </w:rPr>
-      </w:pPr>
-    </w:p>
-    <w:p>
-      <w:pPr>
-        <w:spacing w:line="360" w:lineRule="auto"/>
-        <w:jc w:val="both"/>
-        <w:rPr>
-          <w:rFonts w:ascii="Avenir Next LT Pro Light" w:hAnsi="Avenir Next LT Pro Light" w:cstheme="minorHAnsi"/>
-          <w:bCs/>
-        </w:rPr>
-      </w:pPr>
-    </w:p>
-    <w:p>
-      <w:pPr>
-        <w:spacing w:line="360" w:lineRule="auto"/>
-        <w:jc w:val="both"/>
-        <w:rPr>
-          <w:rFonts w:ascii="Avenir Next LT Pro Light" w:hAnsi="Avenir Next LT Pro Light" w:cstheme="minorHAnsi"/>
-          <w:bCs/>
-        </w:rPr>
-      </w:pPr>
-    </w:p>
-    <w:p>
-      <w:pPr>
         <w:spacing w:before="120" w:after="120" w:line="360" w:lineRule="auto"/>
         <w:jc w:val="both"/>
         <w:rPr>
@@ -1197,6 +1107,41 @@
     </w:p>
     <w:p>
       <w:pPr>
+        <w:spacing w:line="360" w:lineRule="auto"/>
+        <w:jc w:val="both"/>
+        <w:rPr>
+          <w:rFonts w:ascii="Avenir Next LT Pro Light" w:hAnsi="Avenir Next LT Pro Light" w:cstheme="minorHAnsi"/>
+          <w:b/>
+          <w:u w:val="single"/>
+        </w:rPr>
+      </w:pPr>
+      <w:r>
+        <w:rPr>
+          <w:rFonts w:ascii="Avenir Next LT Pro Light" w:hAnsi="Avenir Next LT Pro Light" w:cstheme="minorHAnsi"/>
+          <w:b/>
+          <w:u w:val="single"/>
+        </w:rPr>
+        <w:t>Valori OMI</w:t>
+      </w:r>
+    </w:p>
+    <w:p>
+      <w:pPr>
+        <w:spacing w:line="360" w:lineRule="auto"/>
+        <w:jc w:val="both"/>
+        <w:rPr>
+          <w:rFonts w:ascii="Avenir Next LT Pro Light" w:hAnsi="Avenir Next LT Pro Light" w:cstheme="minorHAnsi"/>
+        </w:rPr>
+      </w:pPr>
+      <w:r>
+        <w:rPr>
+          <w:rFonts w:ascii="Avenir Next LT Pro Light" w:hAnsi="Avenir Next LT Pro Light" w:cstheme="minorHAnsi"/>
+        </w:rPr>
+        <w:t>[VALORI OMI]</w:t>
+      </w:r>
+    </w:p>
+    <w:p>
+      <w:pPr>
+        <w:pageBreakBefore/>
         <w:jc w:val="both"/>
         <w:rPr>
           <w:rFonts w:ascii="Avenir Next LT Pro Light" w:hAnsi="Avenir Next LT Pro Light" w:cstheme="minorHAnsi"/>
@@ -2242,51 +2187,6 @@
           <w:bCs/>
         </w:rPr>
         <w:t xml:space="preserve"> [VALORE COMMERCIALE]</w:t>
-      </w:r>
-    </w:p>
-    <w:p>
-      <w:pPr>
-        <w:spacing w:line="360" w:lineRule="auto"/>
-        <w:jc w:val="both"/>
-        <w:rPr>
-          <w:rFonts w:ascii="Avenir Next LT Pro Light" w:hAnsi="Avenir Next LT Pro Light" w:cstheme="minorHAnsi"/>
-          <w:b/>
-          <w:u w:val="single"/>
-        </w:rPr>
-      </w:pPr>
-    </w:p>
-    <w:p>
-      <w:pPr>
-        <w:spacing w:line="360" w:lineRule="auto"/>
-        <w:jc w:val="both"/>
-        <w:rPr>
-          <w:rFonts w:ascii="Avenir Next LT Pro Light" w:hAnsi="Avenir Next LT Pro Light" w:cstheme="minorHAnsi"/>
-          <w:b/>
-          <w:u w:val="single"/>
-        </w:rPr>
-      </w:pPr>
-      <w:r>
-        <w:rPr>
-          <w:rFonts w:ascii="Avenir Next LT Pro Light" w:hAnsi="Avenir Next LT Pro Light" w:cstheme="minorHAnsi"/>
-          <w:b/>
-          <w:u w:val="single"/>
-        </w:rPr>
-        <w:t>Valori OMI</w:t>
-      </w:r>
-    </w:p>
-    <w:p>
-      <w:pPr>
-        <w:spacing w:line="360" w:lineRule="auto"/>
-        <w:jc w:val="both"/>
-        <w:rPr>
-          <w:rFonts w:ascii="Avenir Next LT Pro Light" w:hAnsi="Avenir Next LT Pro Light" w:cstheme="minorHAnsi"/>
-        </w:rPr>
-      </w:pPr>
-      <w:r>
-        <w:rPr>
-          <w:rFonts w:ascii="Avenir Next LT Pro Light" w:hAnsi="Avenir Next LT Pro Light" w:cstheme="minorHAnsi"/>
-        </w:rPr>
-        <w:t>[VALORI OMI]</w:t>
       </w:r>
     </w:p>
     <w:p>

</xml_diff>

<commit_message>
Adattamenti dal confronto con una valutazione reale
- pertinenze a corpo (scritto "a corpo" o solo l'importo): righe proprie nel
  testo e nel calcolo
- indice di vetustà 0 = non applicato: valore attuale = valore a nuovo e frase
  "si è ritenuto di non applicare detto indice"
- valore commerciale dall'Excel con la sua percentuale [AUMENTO COMMERCIALE]
- parti condizionali nel modello: [SE ...] / [SE NON ...] / [FINE SE]
- indirizzo completo con comune e provincia, data per esteso, importi con i
  centesimi, voci di unicità/criticità con maiuscola e punto e virgola
- titoli tenuti con il testo che segue; carta intestata applicata prima delle
  immagini (evitava una pagina vuota)

Co-Authored-By: Claude Opus 5.5 <noreply@anthropic.com>
Claude-Session: https://claude.ai/code/session_01GFqWfsVatsLJvctcKSGrA2
</commit_message>
<xml_diff>
--- a/valutazioni/modelli/valutazione_modello.docx
+++ b/valutazioni/modelli/valutazione_modello.docx
@@ -117,6 +117,21 @@
         <w:rPr>
           <w:rFonts w:ascii="Avenir Next LT Pro Light" w:hAnsi="Avenir Next LT Pro Light" w:cstheme="minorHAnsi"/>
         </w:rPr>
+        <w:t xml:space="preserve">[COMUNE] ([PROVINCIA])</w:t>
+      </w:r>
+    </w:p>
+    <w:p>
+      <w:pPr>
+        <w:spacing w:line="240" w:lineRule="auto"/>
+        <w:jc w:val="right"/>
+        <w:rPr>
+          <w:rFonts w:ascii="Avenir Next LT Pro Light" w:hAnsi="Avenir Next LT Pro Light" w:cstheme="minorHAnsi"/>
+        </w:rPr>
+      </w:pPr>
+      <w:r>
+        <w:rPr>
+          <w:rFonts w:ascii="Avenir Next LT Pro Light" w:hAnsi="Avenir Next LT Pro Light" w:cstheme="minorHAnsi"/>
+        </w:rPr>
         <w:tab/>
       </w:r>
       <w:r>
@@ -276,28 +291,255 @@
         <w:rPr>
           <w:rFonts w:ascii="Avenir Next LT Pro Light" w:hAnsi="Avenir Next LT Pro Light" w:cstheme="minorHAnsi"/>
         </w:rPr>
+        <w:t xml:space="preserve"> [INDIRIZZO] [COMUNE] ([PROVINCIA]).</w:t>
+      </w:r>
+      <w:r>
+        <w:rPr>
+          <w:rFonts w:ascii="Avenir Next LT Pro Light" w:hAnsi="Avenir Next LT Pro Light" w:cstheme="minorHAnsi"/>
+        </w:rPr>
+        <w:t xml:space="preserve"/>
+      </w:r>
+      <w:r>
+        <w:rPr>
+          <w:rFonts w:ascii="Avenir Next LT Pro Light" w:hAnsi="Avenir Next LT Pro Light" w:cstheme="minorHAnsi"/>
+        </w:rPr>
+        <w:t/>
+      </w:r>
+    </w:p>
+    <w:p>
+      <w:pPr>
+        <w:spacing w:line="240" w:lineRule="auto"/>
+        <w:rPr>
+          <w:rFonts w:ascii="Avenir Next LT Pro Light" w:hAnsi="Avenir Next LT Pro Light" w:cstheme="minorHAnsi"/>
+        </w:rPr>
+      </w:pPr>
+    </w:p>
+    <w:p>
+      <w:pPr>
+        <w:spacing w:line="360" w:lineRule="auto"/>
+        <w:jc w:val="both"/>
+        <w:rPr>
+          <w:rFonts w:ascii="Avenir Next LT Pro Light" w:hAnsi="Avenir Next LT Pro Light" w:cstheme="minorHAnsi"/>
+        </w:rPr>
+      </w:pPr>
+      <w:r>
+        <w:rPr>
+          <w:rFonts w:ascii="Avenir Next LT Pro Light" w:hAnsi="Avenir Next LT Pro Light" w:cstheme="minorHAnsi"/>
+        </w:rPr>
+        <w:t xml:space="preserve">In seguito alla visita da </w:t>
+      </w:r>
+      <w:r>
+        <w:rPr>
+          <w:rFonts w:ascii="Avenir Next LT Pro Light" w:hAnsi="Avenir Next LT Pro Light" w:cstheme="minorHAnsi"/>
+        </w:rPr>
+        <w:t>noi</w:t>
+      </w:r>
+      <w:r>
+        <w:rPr>
+          <w:rFonts w:ascii="Avenir Next LT Pro Light" w:hAnsi="Avenir Next LT Pro Light" w:cstheme="minorHAnsi"/>
+        </w:rPr>
+        <w:t xml:space="preserve"> effettuata all’</w:t>
+      </w:r>
+      <w:r>
+        <w:rPr>
+          <w:rFonts w:ascii="Avenir Next LT Pro Light" w:hAnsi="Avenir Next LT Pro Light" w:cstheme="minorHAnsi"/>
+        </w:rPr>
+        <w:t>immobile oggetto di valutazione</w:t>
+      </w:r>
+      <w:r>
+        <w:rPr>
+          <w:rFonts w:ascii="Avenir Next LT Pro Light" w:hAnsi="Avenir Next LT Pro Light" w:cstheme="minorHAnsi"/>
+        </w:rPr>
+        <w:t xml:space="preserve"> e all’attenta analisi delle schede planimetriche fornitemi posso relazionare quanto segue:</w:t>
+      </w:r>
+    </w:p>
+    <w:p>
+      <w:pPr>
+        <w:spacing w:line="360" w:lineRule="auto"/>
+        <w:jc w:val="both"/>
+        <w:rPr>
+          <w:rFonts w:ascii="Avenir Next LT Pro Light" w:hAnsi="Avenir Next LT Pro Light" w:cstheme="minorHAnsi"/>
+        </w:rPr>
+      </w:pPr>
+      <w:r>
+        <w:rPr>
+          <w:rFonts w:ascii="Avenir Next LT Pro Light" w:hAnsi="Avenir Next LT Pro Light" w:cstheme="minorHAnsi"/>
+          <w:b/>
+        </w:rPr>
+        <w:t>- Immobile ad uso abitazione censito ad uso residenziale al N.C.</w:t>
+      </w:r>
+      <w:r>
+        <w:rPr>
+          <w:rFonts w:ascii="Avenir Next LT Pro Light" w:hAnsi="Avenir Next LT Pro Light" w:cstheme="minorHAnsi"/>
+          <w:b/>
+        </w:rPr>
+        <w:t>F.</w:t>
+      </w:r>
+      <w:r>
+        <w:rPr>
+          <w:rFonts w:ascii="Avenir Next LT Pro Light" w:hAnsi="Avenir Next LT Pro Light" w:cstheme="minorHAnsi"/>
+          <w:b/>
+        </w:rPr>
+        <w:t xml:space="preserve"> di </w:t>
+      </w:r>
+      <w:r>
+        <w:rPr>
+          <w:rFonts w:ascii="Avenir Next LT Pro Light" w:hAnsi="Avenir Next LT Pro Light" w:cstheme="minorHAnsi"/>
+          <w:b/>
+        </w:rPr>
+        <w:t>Treviso</w:t>
+      </w:r>
+      <w:r>
+        <w:rPr>
+          <w:rFonts w:ascii="Avenir Next LT Pro Light" w:hAnsi="Avenir Next LT Pro Light" w:cstheme="minorHAnsi"/>
+          <w:b/>
+        </w:rPr>
+        <w:t>, con necessità di verifiche urbanistiche/catastali</w:t>
+      </w:r>
+      <w:r>
+        <w:rPr>
+          <w:rFonts w:ascii="Avenir Next LT Pro Light" w:hAnsi="Avenir Next LT Pro Light" w:cstheme="minorHAnsi"/>
+          <w:b/>
+        </w:rPr>
+        <w:t>.</w:t>
+      </w:r>
+    </w:p>
+    <w:p>
+      <w:pPr>
+        <w:spacing w:line="360" w:lineRule="auto"/>
+        <w:jc w:val="both"/>
+        <w:rPr>
+          <w:rFonts w:ascii="Avenir Next LT Pro Light" w:hAnsi="Avenir Next LT Pro Light" w:cstheme="minorHAnsi"/>
+        </w:rPr>
+      </w:pPr>
+      <w:r>
+        <w:rPr>
+          <w:rFonts w:ascii="Avenir Next LT Pro Light" w:hAnsi="Avenir Next LT Pro Light" w:cstheme="minorHAnsi"/>
+        </w:rPr>
+        <w:t xml:space="preserve">Al fine di poter determinare il reale </w:t>
+      </w:r>
+      <w:r>
+        <w:rPr>
+          <w:rFonts w:ascii="Avenir Next LT Pro Light" w:hAnsi="Avenir Next LT Pro Light" w:cstheme="minorHAnsi"/>
+        </w:rPr>
+        <w:t>valore</w:t>
+      </w:r>
+      <w:r>
+        <w:rPr>
+          <w:rFonts w:ascii="Avenir Next LT Pro Light" w:hAnsi="Avenir Next LT Pro Light" w:cstheme="minorHAnsi"/>
+        </w:rPr>
+        <w:t xml:space="preserve"> di vendita di tale immobile sono stati considerati diversi fattori d’analisi giungendo alla conclusione del più probabile </w:t>
+      </w:r>
+      <w:r>
+        <w:rPr>
+          <w:rFonts w:ascii="Avenir Next LT Pro Light" w:hAnsi="Avenir Next LT Pro Light" w:cstheme="minorHAnsi"/>
+        </w:rPr>
+        <w:t>valore</w:t>
+      </w:r>
+      <w:r>
+        <w:rPr>
+          <w:rFonts w:ascii="Avenir Next LT Pro Light" w:hAnsi="Avenir Next LT Pro Light" w:cstheme="minorHAnsi"/>
+        </w:rPr>
+        <w:t xml:space="preserve"> di mercato dell’immobile.</w:t>
+      </w:r>
+    </w:p>
+    <w:p>
+      <w:pPr>
+        <w:spacing w:line="360" w:lineRule="auto"/>
+        <w:jc w:val="both"/>
+        <w:rPr>
+          <w:rFonts w:ascii="Avenir Next LT Pro Light" w:hAnsi="Avenir Next LT Pro Light" w:cstheme="minorHAnsi"/>
+        </w:rPr>
+      </w:pPr>
+      <w:r>
+        <w:rPr>
+          <w:rFonts w:ascii="Avenir Next LT Pro Light" w:hAnsi="Avenir Next LT Pro Light" w:cstheme="minorHAnsi"/>
+        </w:rPr>
+        <w:t xml:space="preserve">I fattori più interessanti che determinano il </w:t>
+      </w:r>
+      <w:r>
+        <w:rPr>
+          <w:rFonts w:ascii="Avenir Next LT Pro Light" w:hAnsi="Avenir Next LT Pro Light" w:cstheme="minorHAnsi"/>
+        </w:rPr>
+        <w:t>valore</w:t>
+      </w:r>
+      <w:r>
+        <w:rPr>
+          <w:rFonts w:ascii="Avenir Next LT Pro Light" w:hAnsi="Avenir Next LT Pro Light" w:cstheme="minorHAnsi"/>
+        </w:rPr>
+        <w:t xml:space="preserve"> di vendita dell’immobile sono da ricercarsi nelle caratteristiche dell’immobile stesso quali la tipologia di abitazione ed altri che analizzere</w:t>
+      </w:r>
+      <w:r>
+        <w:rPr>
+          <w:rFonts w:ascii="Avenir Next LT Pro Light" w:hAnsi="Avenir Next LT Pro Light" w:cstheme="minorHAnsi"/>
+        </w:rPr>
+        <w:t>mo nel corso della valutazione.</w:t>
+      </w:r>
+    </w:p>
+    <w:p>
+      <w:pPr>
+        <w:spacing w:line="360" w:lineRule="auto"/>
+        <w:jc w:val="both"/>
+        <w:rPr>
+          <w:rFonts w:ascii="Avenir Next LT Pro Light" w:hAnsi="Avenir Next LT Pro Light" w:cstheme="minorHAnsi"/>
+        </w:rPr>
+      </w:pPr>
+      <w:r>
+        <w:rPr>
+          <w:rFonts w:ascii="Avenir Next LT Pro Light" w:hAnsi="Avenir Next LT Pro Light" w:cstheme="minorHAnsi"/>
+          <w:color w:val="000000"/>
+        </w:rPr>
+        <w:t>Allo scopo</w:t>
+      </w:r>
+      <w:r>
+        <w:rPr>
+          <w:rFonts w:ascii="Avenir Next LT Pro Light" w:hAnsi="Avenir Next LT Pro Light" w:cstheme="minorHAnsi"/>
+          <w:color w:val="000000"/>
+        </w:rPr>
         <w:t xml:space="preserve"> </w:t>
       </w:r>
       <w:r>
         <w:rPr>
           <w:rFonts w:ascii="Avenir Next LT Pro Light" w:hAnsi="Avenir Next LT Pro Light" w:cstheme="minorHAnsi"/>
         </w:rPr>
-        <w:t xml:space="preserve">via </w:t>
-      </w:r>
-      <w:r>
-        <w:rPr>
-          <w:rFonts w:ascii="Avenir Next LT Pro Light" w:hAnsi="Avenir Next LT Pro Light" w:cstheme="minorHAnsi"/>
-        </w:rPr>
-        <w:t>[INDIRIZZO]</w:t>
-      </w:r>
-    </w:p>
-    <w:p>
-      <w:pPr>
-        <w:spacing w:line="240" w:lineRule="auto"/>
-        <w:rPr>
-          <w:rFonts w:ascii="Avenir Next LT Pro Light" w:hAnsi="Avenir Next LT Pro Light" w:cstheme="minorHAnsi"/>
-        </w:rPr>
-      </w:pPr>
+        <w:t xml:space="preserve">di ottenere un valore quanto più vicino al </w:t>
+      </w:r>
+      <w:r>
+        <w:rPr>
+          <w:rFonts w:ascii="Avenir Next LT Pro Light" w:hAnsi="Avenir Next LT Pro Light" w:cstheme="minorHAnsi"/>
+        </w:rPr>
+        <w:t>valore</w:t>
+      </w:r>
+      <w:r>
+        <w:rPr>
+          <w:rFonts w:ascii="Avenir Next LT Pro Light" w:hAnsi="Avenir Next LT Pro Light" w:cstheme="minorHAnsi"/>
+        </w:rPr>
+        <w:t xml:space="preserve"> di mercato, si tiene conto di tutte quelle caratteristiche intrinseche ed estrinseche che possono influenzare sia il </w:t>
+      </w:r>
+      <w:r>
+        <w:rPr>
+          <w:rFonts w:ascii="Avenir Next LT Pro Light" w:hAnsi="Avenir Next LT Pro Light" w:cstheme="minorHAnsi"/>
+        </w:rPr>
+        <w:t>valore</w:t>
+      </w:r>
+      <w:r>
+        <w:rPr>
+          <w:rFonts w:ascii="Avenir Next LT Pro Light" w:hAnsi="Avenir Next LT Pro Light" w:cstheme="minorHAnsi"/>
+        </w:rPr>
+        <w:t xml:space="preserve"> di vendita, quanto la quantità dei clienti </w:t>
+      </w:r>
+      <w:r>
+        <w:rPr>
+          <w:rFonts w:ascii="Avenir Next LT Pro Light" w:hAnsi="Avenir Next LT Pro Light" w:cstheme="minorHAnsi"/>
+        </w:rPr>
+        <w:t>potenzialmente interessati all’</w:t>
+      </w:r>
+      <w:r>
+        <w:rPr>
+          <w:rFonts w:ascii="Avenir Next LT Pro Light" w:hAnsi="Avenir Next LT Pro Light" w:cstheme="minorHAnsi"/>
+        </w:rPr>
+        <w:t xml:space="preserve">acquisto del Vostro immobile. </w:t>
+      </w:r>
     </w:p>
     <w:p>
       <w:pPr>
@@ -307,36 +549,6 @@
           <w:rFonts w:ascii="Avenir Next LT Pro Light" w:hAnsi="Avenir Next LT Pro Light" w:cstheme="minorHAnsi"/>
         </w:rPr>
       </w:pPr>
-      <w:r>
-        <w:rPr>
-          <w:rFonts w:ascii="Avenir Next LT Pro Light" w:hAnsi="Avenir Next LT Pro Light" w:cstheme="minorHAnsi"/>
-        </w:rPr>
-        <w:t xml:space="preserve">In seguito alla visita da </w:t>
-      </w:r>
-      <w:r>
-        <w:rPr>
-          <w:rFonts w:ascii="Avenir Next LT Pro Light" w:hAnsi="Avenir Next LT Pro Light" w:cstheme="minorHAnsi"/>
-        </w:rPr>
-        <w:t>noi</w:t>
-      </w:r>
-      <w:r>
-        <w:rPr>
-          <w:rFonts w:ascii="Avenir Next LT Pro Light" w:hAnsi="Avenir Next LT Pro Light" w:cstheme="minorHAnsi"/>
-        </w:rPr>
-        <w:t xml:space="preserve"> effettuata all’</w:t>
-      </w:r>
-      <w:r>
-        <w:rPr>
-          <w:rFonts w:ascii="Avenir Next LT Pro Light" w:hAnsi="Avenir Next LT Pro Light" w:cstheme="minorHAnsi"/>
-        </w:rPr>
-        <w:t>immobile oggetto di valutazione</w:t>
-      </w:r>
-      <w:r>
-        <w:rPr>
-          <w:rFonts w:ascii="Avenir Next LT Pro Light" w:hAnsi="Avenir Next LT Pro Light" w:cstheme="minorHAnsi"/>
-        </w:rPr>
-        <w:t xml:space="preserve"> e all’attenta analisi delle schede planimetriche fornitemi posso relazionare quanto segue:</w:t>
-      </w:r>
     </w:p>
     <w:p>
       <w:pPr>
@@ -346,48 +558,6 @@
           <w:rFonts w:ascii="Avenir Next LT Pro Light" w:hAnsi="Avenir Next LT Pro Light" w:cstheme="minorHAnsi"/>
         </w:rPr>
       </w:pPr>
-      <w:r>
-        <w:rPr>
-          <w:rFonts w:ascii="Avenir Next LT Pro Light" w:hAnsi="Avenir Next LT Pro Light" w:cstheme="minorHAnsi"/>
-          <w:b/>
-        </w:rPr>
-        <w:t>- Immobile ad uso abitazione censito ad uso residenziale al N.C.</w:t>
-      </w:r>
-      <w:r>
-        <w:rPr>
-          <w:rFonts w:ascii="Avenir Next LT Pro Light" w:hAnsi="Avenir Next LT Pro Light" w:cstheme="minorHAnsi"/>
-          <w:b/>
-        </w:rPr>
-        <w:t>F.</w:t>
-      </w:r>
-      <w:r>
-        <w:rPr>
-          <w:rFonts w:ascii="Avenir Next LT Pro Light" w:hAnsi="Avenir Next LT Pro Light" w:cstheme="minorHAnsi"/>
-          <w:b/>
-        </w:rPr>
-        <w:t xml:space="preserve"> di </w:t>
-      </w:r>
-      <w:r>
-        <w:rPr>
-          <w:rFonts w:ascii="Avenir Next LT Pro Light" w:hAnsi="Avenir Next LT Pro Light" w:cstheme="minorHAnsi"/>
-          <w:b/>
-        </w:rPr>
-        <w:t>Treviso</w:t>
-      </w:r>
-      <w:r>
-        <w:rPr>
-          <w:rFonts w:ascii="Avenir Next LT Pro Light" w:hAnsi="Avenir Next LT Pro Light" w:cstheme="minorHAnsi"/>
-          <w:b/>
-        </w:rPr>
-        <w:t>, con necessità di verifiche urbanistiche/catastali</w:t>
-      </w:r>
-      <w:r>
-        <w:rPr>
-          <w:rFonts w:ascii="Avenir Next LT Pro Light" w:hAnsi="Avenir Next LT Pro Light" w:cstheme="minorHAnsi"/>
-          <w:b/>
-        </w:rPr>
-        <w:t>.</w:t>
-      </w:r>
     </w:p>
     <w:p>
       <w:pPr>
@@ -397,143 +567,39 @@
           <w:rFonts w:ascii="Avenir Next LT Pro Light" w:hAnsi="Avenir Next LT Pro Light" w:cstheme="minorHAnsi"/>
         </w:rPr>
       </w:pPr>
-      <w:r>
-        <w:rPr>
-          <w:rFonts w:ascii="Avenir Next LT Pro Light" w:hAnsi="Avenir Next LT Pro Light" w:cstheme="minorHAnsi"/>
-        </w:rPr>
-        <w:t xml:space="preserve">Al fine di poter determinare il reale </w:t>
-      </w:r>
-      <w:r>
-        <w:rPr>
-          <w:rFonts w:ascii="Avenir Next LT Pro Light" w:hAnsi="Avenir Next LT Pro Light" w:cstheme="minorHAnsi"/>
-        </w:rPr>
-        <w:t>valore</w:t>
-      </w:r>
-      <w:r>
-        <w:rPr>
-          <w:rFonts w:ascii="Avenir Next LT Pro Light" w:hAnsi="Avenir Next LT Pro Light" w:cstheme="minorHAnsi"/>
-        </w:rPr>
-        <w:t xml:space="preserve"> di vendita di tale immobile sono stati considerati diversi fattori d’analisi giungendo alla conclusione del più probabile </w:t>
-      </w:r>
-      <w:r>
-        <w:rPr>
-          <w:rFonts w:ascii="Avenir Next LT Pro Light" w:hAnsi="Avenir Next LT Pro Light" w:cstheme="minorHAnsi"/>
-        </w:rPr>
-        <w:t>valore</w:t>
-      </w:r>
-      <w:r>
-        <w:rPr>
-          <w:rFonts w:ascii="Avenir Next LT Pro Light" w:hAnsi="Avenir Next LT Pro Light" w:cstheme="minorHAnsi"/>
-        </w:rPr>
-        <w:t xml:space="preserve"> di mercato dell’immobile.</w:t>
-      </w:r>
     </w:p>
     <w:p>
       <w:pPr>
         <w:spacing w:line="360" w:lineRule="auto"/>
         <w:jc w:val="both"/>
         <w:rPr>
-          <w:rFonts w:ascii="Avenir Next LT Pro Light" w:hAnsi="Avenir Next LT Pro Light" w:cstheme="minorHAnsi"/>
-        </w:rPr>
-      </w:pPr>
-      <w:r>
-        <w:rPr>
-          <w:rFonts w:ascii="Avenir Next LT Pro Light" w:hAnsi="Avenir Next LT Pro Light" w:cstheme="minorHAnsi"/>
-        </w:rPr>
-        <w:t xml:space="preserve">I fattori più interessanti che determinano il </w:t>
-      </w:r>
-      <w:r>
-        <w:rPr>
-          <w:rFonts w:ascii="Avenir Next LT Pro Light" w:hAnsi="Avenir Next LT Pro Light" w:cstheme="minorHAnsi"/>
-        </w:rPr>
-        <w:t>valore</w:t>
-      </w:r>
-      <w:r>
-        <w:rPr>
-          <w:rFonts w:ascii="Avenir Next LT Pro Light" w:hAnsi="Avenir Next LT Pro Light" w:cstheme="minorHAnsi"/>
-        </w:rPr>
-        <w:t xml:space="preserve"> di vendita dell’immobile sono da ricercarsi nelle caratteristiche dell’immobile stesso quali la tipologia di abitazione ed altri che analizzere</w:t>
-      </w:r>
-      <w:r>
-        <w:rPr>
-          <w:rFonts w:ascii="Avenir Next LT Pro Light" w:hAnsi="Avenir Next LT Pro Light" w:cstheme="minorHAnsi"/>
-        </w:rPr>
-        <w:t>mo nel corso della valutazione.</w:t>
-      </w:r>
+          <w:rFonts w:ascii="Avenir Next LT Pro" w:hAnsi="Avenir Next LT Pro" w:cstheme="minorHAnsi"/>
+        </w:rPr>
+      </w:pPr>
     </w:p>
     <w:p>
       <w:pPr>
         <w:spacing w:line="360" w:lineRule="auto"/>
         <w:jc w:val="both"/>
         <w:rPr>
-          <w:rFonts w:ascii="Avenir Next LT Pro Light" w:hAnsi="Avenir Next LT Pro Light" w:cstheme="minorHAnsi"/>
-        </w:rPr>
-      </w:pPr>
-      <w:r>
-        <w:rPr>
-          <w:rFonts w:ascii="Avenir Next LT Pro Light" w:hAnsi="Avenir Next LT Pro Light" w:cstheme="minorHAnsi"/>
-          <w:color w:val="000000"/>
-        </w:rPr>
-        <w:t>Allo scopo</w:t>
-      </w:r>
-      <w:r>
-        <w:rPr>
-          <w:rFonts w:ascii="Avenir Next LT Pro Light" w:hAnsi="Avenir Next LT Pro Light" w:cstheme="minorHAnsi"/>
-          <w:color w:val="000000"/>
-        </w:rPr>
-        <w:t xml:space="preserve"> </w:t>
-      </w:r>
-      <w:r>
-        <w:rPr>
-          <w:rFonts w:ascii="Avenir Next LT Pro Light" w:hAnsi="Avenir Next LT Pro Light" w:cstheme="minorHAnsi"/>
-        </w:rPr>
-        <w:t xml:space="preserve">di ottenere un valore quanto più vicino al </w:t>
-      </w:r>
-      <w:r>
-        <w:rPr>
-          <w:rFonts w:ascii="Avenir Next LT Pro Light" w:hAnsi="Avenir Next LT Pro Light" w:cstheme="minorHAnsi"/>
-        </w:rPr>
-        <w:t>valore</w:t>
-      </w:r>
-      <w:r>
-        <w:rPr>
-          <w:rFonts w:ascii="Avenir Next LT Pro Light" w:hAnsi="Avenir Next LT Pro Light" w:cstheme="minorHAnsi"/>
-        </w:rPr>
-        <w:t xml:space="preserve"> di mercato, si tiene conto di tutte quelle caratteristiche intrinseche ed estrinseche che possono influenzare sia il </w:t>
-      </w:r>
-      <w:r>
-        <w:rPr>
-          <w:rFonts w:ascii="Avenir Next LT Pro Light" w:hAnsi="Avenir Next LT Pro Light" w:cstheme="minorHAnsi"/>
-        </w:rPr>
-        <w:t>valore</w:t>
-      </w:r>
-      <w:r>
-        <w:rPr>
-          <w:rFonts w:ascii="Avenir Next LT Pro Light" w:hAnsi="Avenir Next LT Pro Light" w:cstheme="minorHAnsi"/>
-        </w:rPr>
-        <w:t xml:space="preserve"> di vendita, quanto la quantità dei clienti </w:t>
-      </w:r>
-      <w:r>
-        <w:rPr>
-          <w:rFonts w:ascii="Avenir Next LT Pro Light" w:hAnsi="Avenir Next LT Pro Light" w:cstheme="minorHAnsi"/>
-        </w:rPr>
-        <w:t>potenzialmente interessati all’</w:t>
-      </w:r>
-      <w:r>
-        <w:rPr>
-          <w:rFonts w:ascii="Avenir Next LT Pro Light" w:hAnsi="Avenir Next LT Pro Light" w:cstheme="minorHAnsi"/>
-        </w:rPr>
-        <w:t xml:space="preserve">acquisto del Vostro immobile. </w:t>
-      </w:r>
+          <w:rFonts w:ascii="Avenir Next LT Pro" w:hAnsi="Avenir Next LT Pro" w:cstheme="minorHAnsi"/>
+        </w:rPr>
+      </w:pPr>
     </w:p>
     <w:p>
       <w:pPr>
         <w:spacing w:line="360" w:lineRule="auto"/>
         <w:jc w:val="both"/>
         <w:rPr>
-          <w:rFonts w:ascii="Avenir Next LT Pro Light" w:hAnsi="Avenir Next LT Pro Light" w:cstheme="minorHAnsi"/>
-        </w:rPr>
-      </w:pPr>
+          <w:rFonts w:ascii="Avenir Next LT Pro" w:hAnsi="Avenir Next LT Pro" w:cstheme="minorHAnsi"/>
+        </w:rPr>
+      </w:pPr>
+      <w:r>
+        <w:rPr>
+          <w:rFonts w:ascii="Avenir Next LT Pro" w:hAnsi="Avenir Next LT Pro" w:cstheme="minorHAnsi"/>
+        </w:rPr>
+        <w:t>Tali fattori possono così riassumersi in:</w:t>
+      </w:r>
     </w:p>
     <w:p>
       <w:pPr>
@@ -546,57 +612,7 @@
     </w:p>
     <w:p>
       <w:pPr>
-        <w:spacing w:line="360" w:lineRule="auto"/>
-        <w:jc w:val="both"/>
-        <w:rPr>
-          <w:rFonts w:ascii="Avenir Next LT Pro Light" w:hAnsi="Avenir Next LT Pro Light" w:cstheme="minorHAnsi"/>
-        </w:rPr>
-      </w:pPr>
-    </w:p>
-    <w:p>
-      <w:pPr>
-        <w:spacing w:line="360" w:lineRule="auto"/>
-        <w:jc w:val="both"/>
-        <w:rPr>
-          <w:rFonts w:ascii="Avenir Next LT Pro" w:hAnsi="Avenir Next LT Pro" w:cstheme="minorHAnsi"/>
-        </w:rPr>
-      </w:pPr>
-    </w:p>
-    <w:p>
-      <w:pPr>
-        <w:spacing w:line="360" w:lineRule="auto"/>
-        <w:jc w:val="both"/>
-        <w:rPr>
-          <w:rFonts w:ascii="Avenir Next LT Pro" w:hAnsi="Avenir Next LT Pro" w:cstheme="minorHAnsi"/>
-        </w:rPr>
-      </w:pPr>
-    </w:p>
-    <w:p>
-      <w:pPr>
-        <w:spacing w:line="360" w:lineRule="auto"/>
-        <w:jc w:val="both"/>
-        <w:rPr>
-          <w:rFonts w:ascii="Avenir Next LT Pro" w:hAnsi="Avenir Next LT Pro" w:cstheme="minorHAnsi"/>
-        </w:rPr>
-      </w:pPr>
-      <w:r>
-        <w:rPr>
-          <w:rFonts w:ascii="Avenir Next LT Pro" w:hAnsi="Avenir Next LT Pro" w:cstheme="minorHAnsi"/>
-        </w:rPr>
-        <w:t>Tali fattori possono così riassumersi in:</w:t>
-      </w:r>
-    </w:p>
-    <w:p>
-      <w:pPr>
-        <w:spacing w:line="360" w:lineRule="auto"/>
-        <w:jc w:val="both"/>
-        <w:rPr>
-          <w:rFonts w:ascii="Avenir Next LT Pro Light" w:hAnsi="Avenir Next LT Pro Light" w:cstheme="minorHAnsi"/>
-        </w:rPr>
-      </w:pPr>
-    </w:p>
-    <w:p>
-      <w:pPr>
+        <w:keepNext/>
         <w:spacing w:line="360" w:lineRule="auto"/>
         <w:jc w:val="both"/>
         <w:rPr>
@@ -641,7 +657,7 @@
           <w:sz w:val="20"/>
           <w:szCs w:val="20"/>
         </w:rPr>
-        <w:t xml:space="preserve">- [PRINCIPIO DI UNICITA]</w:t>
+        <w:t xml:space="preserve">- [PRINCIPIO DI UNICITA];</w:t>
       </w:r>
     </w:p>
     <w:p>
@@ -657,6 +673,7 @@
     </w:p>
     <w:p>
       <w:pPr>
+        <w:keepNext/>
         <w:spacing w:line="360" w:lineRule="auto"/>
         <w:jc w:val="both"/>
         <w:rPr>
@@ -701,7 +718,7 @@
           <w:sz w:val="20"/>
           <w:szCs w:val="20"/>
         </w:rPr>
-        <w:t xml:space="preserve">- [CRITICITA]</w:t>
+        <w:t xml:space="preserve">- [CRITICITA];</w:t>
       </w:r>
     </w:p>
     <w:p>
@@ -890,6 +907,7 @@
     </w:p>
     <w:p>
       <w:pPr>
+        <w:keepNext/>
         <w:spacing w:line="360" w:lineRule="auto"/>
         <w:jc w:val="center"/>
         <w:rPr>
@@ -924,6 +942,7 @@
     </w:p>
     <w:p>
       <w:pPr>
+        <w:keepNext/>
         <w:spacing w:line="360" w:lineRule="auto"/>
         <w:jc w:val="both"/>
         <w:rPr>
@@ -1034,6 +1053,23 @@
     </w:p>
     <w:p>
       <w:pPr>
+        <w:spacing w:line="360" w:lineRule="auto"/>
+        <w:jc w:val="both"/>
+        <w:rPr>
+          <w:rFonts w:ascii="Avenir Next LT Pro Light" w:hAnsi="Avenir Next LT Pro Light" w:cstheme="minorHAnsi"/>
+          <w:b/>
+        </w:rPr>
+      </w:pPr>
+      <w:r>
+        <w:rPr>
+          <w:rFonts w:ascii="Avenir Next LT Pro Light" w:hAnsi="Avenir Next LT Pro Light" w:cstheme="minorHAnsi"/>
+        </w:rPr>
+        <w:t xml:space="preserve">[SE PERTINENZE]</w:t>
+      </w:r>
+    </w:p>
+    <w:p>
+      <w:pPr>
+        <w:keepNext/>
         <w:spacing w:line="360" w:lineRule="auto"/>
         <w:jc w:val="both"/>
         <w:rPr>
@@ -1069,30 +1105,8 @@
       <w:r>
         <w:rPr>
           <w:rFonts w:ascii="Avenir Next LT Pro Light" w:hAnsi="Avenir Next LT Pro Light" w:cstheme="minorHAnsi"/>
-          <w:b/>
-        </w:rPr>
-        <w:t xml:space="preserve">[PERTINENZA]</w:t>
-      </w:r>
-      <w:r>
-        <w:rPr>
-          <w:rFonts w:ascii="Avenir Next LT Pro Light" w:hAnsi="Avenir Next LT Pro Light" w:cstheme="minorHAnsi"/>
-          <w:bCs/>
-        </w:rPr>
-        <w:t xml:space="preserve"> per un totale di </w:t>
-      </w:r>
-      <w:r>
-        <w:rPr>
-          <w:rFonts w:ascii="Avenir Next LT Pro Light" w:hAnsi="Avenir Next LT Pro Light" w:cstheme="minorHAnsi"/>
-          <w:b/>
-        </w:rPr>
-        <w:t xml:space="preserve">[MQ PERTINENZA]</w:t>
-      </w:r>
-      <w:r>
-        <w:rPr>
-          <w:rFonts w:ascii="Avenir Next LT Pro Light" w:hAnsi="Avenir Next LT Pro Light" w:cstheme="minorHAnsi"/>
-          <w:bCs/>
-        </w:rPr>
-        <w:t xml:space="preserve"> mq calcolati [QUOTA PERTINENZA] sul valore di mercato;</w:t>
+        </w:rPr>
+        <w:t xml:space="preserve">[SE NON A CORPO]</w:t>
       </w:r>
     </w:p>
     <w:p>
@@ -1104,9 +1118,136 @@
           <w:bCs/>
         </w:rPr>
       </w:pPr>
-    </w:p>
-    <w:p>
-      <w:pPr>
+      <w:r>
+        <w:rPr>
+          <w:rFonts w:ascii="Avenir Next LT Pro Light" w:hAnsi="Avenir Next LT Pro Light" w:cstheme="minorHAnsi"/>
+          <w:b/>
+        </w:rPr>
+        <w:t xml:space="preserve">[PERTINENZA]</w:t>
+      </w:r>
+      <w:r>
+        <w:rPr>
+          <w:rFonts w:ascii="Avenir Next LT Pro Light" w:hAnsi="Avenir Next LT Pro Light" w:cstheme="minorHAnsi"/>
+          <w:bCs/>
+        </w:rPr>
+        <w:t xml:space="preserve"> per un totale di </w:t>
+      </w:r>
+      <w:r>
+        <w:rPr>
+          <w:rFonts w:ascii="Avenir Next LT Pro Light" w:hAnsi="Avenir Next LT Pro Light" w:cstheme="minorHAnsi"/>
+          <w:b/>
+        </w:rPr>
+        <w:t xml:space="preserve">[MQ PERTINENZA]</w:t>
+      </w:r>
+      <w:r>
+        <w:rPr>
+          <w:rFonts w:ascii="Avenir Next LT Pro Light" w:hAnsi="Avenir Next LT Pro Light" w:cstheme="minorHAnsi"/>
+          <w:bCs/>
+        </w:rPr>
+        <w:t xml:space="preserve"> mq calcolati [QUOTA PERTINENZA] sul valore di mercato;</w:t>
+      </w:r>
+    </w:p>
+    <w:p>
+      <w:pPr>
+        <w:spacing w:before="120" w:after="120" w:line="360" w:lineRule="auto"/>
+        <w:jc w:val="both"/>
+        <w:rPr>
+          <w:rFonts w:ascii="Avenir Next LT Pro Light" w:hAnsi="Avenir Next LT Pro Light" w:cstheme="minorHAnsi"/>
+          <w:bCs/>
+        </w:rPr>
+      </w:pPr>
+      <w:r>
+        <w:rPr>
+          <w:rFonts w:ascii="Avenir Next LT Pro Light" w:hAnsi="Avenir Next LT Pro Light" w:cstheme="minorHAnsi"/>
+        </w:rPr>
+        <w:t xml:space="preserve">[FINE SE]</w:t>
+      </w:r>
+    </w:p>
+    <w:p>
+      <w:pPr>
+        <w:spacing w:before="120" w:after="120" w:line="360" w:lineRule="auto"/>
+        <w:jc w:val="both"/>
+        <w:rPr>
+          <w:rFonts w:ascii="Avenir Next LT Pro Light" w:hAnsi="Avenir Next LT Pro Light" w:cstheme="minorHAnsi"/>
+          <w:bCs/>
+        </w:rPr>
+      </w:pPr>
+      <w:r>
+        <w:rPr>
+          <w:rFonts w:ascii="Avenir Next LT Pro Light" w:hAnsi="Avenir Next LT Pro Light" w:cstheme="minorHAnsi"/>
+        </w:rPr>
+        <w:t xml:space="preserve">[SE A CORPO]</w:t>
+      </w:r>
+    </w:p>
+    <w:p>
+      <w:pPr>
+        <w:spacing w:before="120" w:after="120" w:line="360" w:lineRule="auto"/>
+        <w:jc w:val="both"/>
+        <w:rPr>
+          <w:rFonts w:ascii="Avenir Next LT Pro Light" w:hAnsi="Avenir Next LT Pro Light" w:cstheme="minorHAnsi"/>
+          <w:bCs/>
+        </w:rPr>
+      </w:pPr>
+      <w:r>
+        <w:rPr>
+          <w:rFonts w:ascii="Avenir Next LT Pro Light" w:hAnsi="Avenir Next LT Pro Light" w:cstheme="minorHAnsi"/>
+          <w:b/>
+        </w:rPr>
+        <w:t xml:space="preserve">[PERTINENZA]:</w:t>
+      </w:r>
+      <w:r>
+        <w:rPr>
+          <w:rFonts w:ascii="Avenir Next LT Pro Light" w:hAnsi="Avenir Next LT Pro Light" w:cstheme="minorHAnsi"/>
+          <w:bCs/>
+        </w:rPr>
+        <w:t xml:space="preserve"> calcolato a corpo;</w:t>
+      </w:r>
+    </w:p>
+    <w:p>
+      <w:pPr>
+        <w:spacing w:before="120" w:after="120" w:line="360" w:lineRule="auto"/>
+        <w:jc w:val="both"/>
+        <w:rPr>
+          <w:rFonts w:ascii="Avenir Next LT Pro Light" w:hAnsi="Avenir Next LT Pro Light" w:cstheme="minorHAnsi"/>
+          <w:bCs/>
+        </w:rPr>
+      </w:pPr>
+      <w:r>
+        <w:rPr>
+          <w:rFonts w:ascii="Avenir Next LT Pro Light" w:hAnsi="Avenir Next LT Pro Light" w:cstheme="minorHAnsi"/>
+        </w:rPr>
+        <w:t xml:space="preserve">[FINE SE]</w:t>
+      </w:r>
+    </w:p>
+    <w:p>
+      <w:pPr>
+        <w:spacing w:before="120" w:after="120" w:line="360" w:lineRule="auto"/>
+        <w:jc w:val="both"/>
+        <w:rPr>
+          <w:rFonts w:ascii="Avenir Next LT Pro Light" w:hAnsi="Avenir Next LT Pro Light" w:cstheme="minorHAnsi"/>
+          <w:bCs/>
+        </w:rPr>
+      </w:pPr>
+      <w:r>
+        <w:rPr>
+          <w:rFonts w:ascii="Avenir Next LT Pro Light" w:hAnsi="Avenir Next LT Pro Light" w:cstheme="minorHAnsi"/>
+        </w:rPr>
+        <w:t xml:space="preserve">[FINE SE]</w:t>
+      </w:r>
+    </w:p>
+    <w:p>
+      <w:pPr>
+        <w:spacing w:before="120" w:after="120" w:line="360" w:lineRule="auto"/>
+        <w:jc w:val="both"/>
+        <w:rPr>
+          <w:rFonts w:ascii="Avenir Next LT Pro Light" w:hAnsi="Avenir Next LT Pro Light" w:cstheme="minorHAnsi"/>
+          <w:bCs/>
+        </w:rPr>
+      </w:pPr>
+    </w:p>
+    <w:p>
+      <w:pPr>
+        <w:keepNext/>
         <w:spacing w:line="360" w:lineRule="auto"/>
         <w:jc w:val="both"/>
         <w:rPr>
@@ -1380,6 +1521,19 @@
       <w:r>
         <w:rPr>
           <w:rFonts w:ascii="Avenir Next LT Pro Light" w:hAnsi="Avenir Next LT Pro Light" w:cstheme="minorHAnsi"/>
+        </w:rPr>
+        <w:t xml:space="preserve">[SE NON A CORPO]</w:t>
+      </w:r>
+    </w:p>
+    <w:p>
+      <w:pPr>
+        <w:rPr>
+          <w:rFonts w:ascii="Avenir Next LT Pro Light" w:hAnsi="Avenir Next LT Pro Light" w:cstheme="minorHAnsi"/>
+        </w:rPr>
+      </w:pPr>
+      <w:r>
+        <w:rPr>
+          <w:rFonts w:ascii="Avenir Next LT Pro Light" w:hAnsi="Avenir Next LT Pro Light" w:cstheme="minorHAnsi"/>
           <w:b/>
         </w:rPr>
         <w:t xml:space="preserve">- </w:t>
@@ -1564,6 +1718,223 @@
           <w:b/>
         </w:rPr>
       </w:pPr>
+      <w:r>
+        <w:rPr>
+          <w:rFonts w:ascii="Avenir Next LT Pro Light" w:hAnsi="Avenir Next LT Pro Light" w:cstheme="minorHAnsi"/>
+        </w:rPr>
+        <w:t xml:space="preserve">[FINE SE]</w:t>
+      </w:r>
+    </w:p>
+    <w:p>
+      <w:pPr>
+        <w:rPr>
+          <w:rFonts w:ascii="Avenir Next LT Pro Light" w:hAnsi="Avenir Next LT Pro Light" w:cstheme="minorHAnsi"/>
+        </w:rPr>
+      </w:pPr>
+      <w:r>
+        <w:rPr>
+          <w:rFonts w:ascii="Avenir Next LT Pro Light" w:hAnsi="Avenir Next LT Pro Light" w:cstheme="minorHAnsi"/>
+        </w:rPr>
+        <w:t xml:space="preserve">[SE A CORPO]</w:t>
+      </w:r>
+    </w:p>
+    <w:p>
+      <w:pPr>
+        <w:rPr>
+          <w:rFonts w:ascii="Avenir Next LT Pro Light" w:hAnsi="Avenir Next LT Pro Light" w:cstheme="minorHAnsi"/>
+        </w:rPr>
+      </w:pPr>
+      <w:r>
+        <w:rPr>
+          <w:rFonts w:ascii="Avenir Next LT Pro Light" w:hAnsi="Avenir Next LT Pro Light" w:cstheme="minorHAnsi"/>
+          <w:b/>
+        </w:rPr>
+        <w:t xml:space="preserve">- </w:t>
+      </w:r>
+      <w:r>
+        <w:rPr>
+          <w:rFonts w:ascii="Avenir Next LT Pro Light" w:hAnsi="Avenir Next LT Pro Light" w:cstheme="minorHAnsi"/>
+          <w:b/>
+        </w:rPr>
+        <w:t xml:space="preserve">[PERTINENZA]</w:t>
+      </w:r>
+      <w:r>
+        <w:rPr>
+          <w:rFonts w:ascii="Avenir Next LT Pro Light" w:hAnsi="Avenir Next LT Pro Light" w:cstheme="minorHAnsi"/>
+          <w:b/>
+        </w:rPr>
+        <w:t xml:space="preserve">:</w:t>
+      </w:r>
+    </w:p>
+    <w:p>
+      <w:pPr>
+        <w:ind w:left="2124" w:firstLine="708"/>
+        <w:rPr>
+          <w:rFonts w:ascii="Avenir Next LT Pro Light" w:hAnsi="Avenir Next LT Pro Light" w:cstheme="minorHAnsi"/>
+          <w:b/>
+        </w:rPr>
+      </w:pPr>
+      <w:r>
+        <w:rPr>
+          <w:rFonts w:ascii="Avenir Next LT Pro Light" w:hAnsi="Avenir Next LT Pro Light" w:cstheme="minorHAnsi"/>
+        </w:rPr>
+        <w:t xml:space="preserve"> </w:t>
+      </w:r>
+      <w:r>
+        <w:rPr>
+          <w:rFonts w:ascii="Avenir Next LT Pro Light" w:hAnsi="Avenir Next LT Pro Light" w:cstheme="minorHAnsi"/>
+        </w:rPr>
+        <w:t xml:space="preserve">a corpo</w:t>
+      </w:r>
+      <w:r>
+        <w:rPr>
+          <w:rFonts w:ascii="Avenir Next LT Pro Light" w:hAnsi="Avenir Next LT Pro Light" w:cstheme="minorHAnsi"/>
+          <w:b/>
+          <w:bCs/>
+        </w:rPr>
+        <w:t/>
+      </w:r>
+      <w:r>
+        <w:rPr>
+          <w:rFonts w:ascii="Avenir Next LT Pro Light" w:hAnsi="Avenir Next LT Pro Light" w:cstheme="minorHAnsi"/>
+          <w:b/>
+          <w:bCs/>
+        </w:rPr>
+        <w:t xml:space="preserve"/>
+      </w:r>
+      <w:r>
+        <w:rPr>
+          <w:rFonts w:ascii="Avenir Next LT Pro Light" w:hAnsi="Avenir Next LT Pro Light" w:cstheme="minorHAnsi"/>
+        </w:rPr>
+        <w:t xml:space="preserve"> </w:t>
+      </w:r>
+      <w:r>
+        <w:rPr>
+          <w:rFonts w:ascii="Avenir Next LT Pro Light" w:hAnsi="Avenir Next LT Pro Light" w:cstheme="minorHAnsi"/>
+        </w:rPr>
+        <w:tab/>
+      </w:r>
+      <w:r>
+        <w:rPr>
+          <w:rFonts w:ascii="Avenir Next LT Pro Light" w:hAnsi="Avenir Next LT Pro Light" w:cstheme="minorHAnsi"/>
+        </w:rPr>
+        <w:t xml:space="preserve">         </w:t>
+      </w:r>
+      <w:r>
+        <w:rPr>
+          <w:rFonts w:ascii="Avenir Next LT Pro Light" w:hAnsi="Avenir Next LT Pro Light" w:cstheme="minorHAnsi"/>
+        </w:rPr>
+        <w:tab/>
+      </w:r>
+      <w:r>
+        <w:rPr>
+          <w:rFonts w:ascii="Avenir Next LT Pro Light" w:hAnsi="Avenir Next LT Pro Light" w:cstheme="minorHAnsi"/>
+        </w:rPr>
+        <w:t xml:space="preserve"> </w:t>
+      </w:r>
+      <w:r>
+        <w:rPr>
+          <w:rFonts w:ascii="Avenir Next LT Pro Light" w:hAnsi="Avenir Next LT Pro Light" w:cstheme="minorHAnsi"/>
+        </w:rPr>
+        <w:t xml:space="preserve">      </w:t>
+      </w:r>
+      <w:r>
+        <w:rPr>
+          <w:rFonts w:ascii="Avenir Next LT Pro Light" w:hAnsi="Avenir Next LT Pro Light" w:cstheme="minorHAnsi"/>
+        </w:rPr>
+        <w:t xml:space="preserve"> </w:t>
+      </w:r>
+      <w:r>
+        <w:rPr>
+          <w:rFonts w:ascii="Avenir Next LT Pro Light" w:hAnsi="Avenir Next LT Pro Light" w:cstheme="minorHAnsi"/>
+        </w:rPr>
+        <w:t xml:space="preserve"> </w:t>
+      </w:r>
+      <w:r>
+        <w:rPr>
+          <w:rFonts w:ascii="Avenir Next LT Pro Light" w:hAnsi="Avenir Next LT Pro Light" w:cstheme="minorHAnsi"/>
+        </w:rPr>
+        <w:t xml:space="preserve">        </w:t>
+      </w:r>
+      <w:r>
+        <w:rPr>
+          <w:rFonts w:ascii="Avenir Next LT Pro Light" w:hAnsi="Avenir Next LT Pro Light" w:cstheme="minorHAnsi"/>
+        </w:rPr>
+        <w:t xml:space="preserve"> </w:t>
+      </w:r>
+      <w:r>
+        <w:rPr>
+          <w:rFonts w:ascii="Avenir Next LT Pro Light" w:hAnsi="Avenir Next LT Pro Light" w:cstheme="minorHAnsi"/>
+        </w:rPr>
+        <w:t xml:space="preserve">     </w:t>
+      </w:r>
+      <w:r>
+        <w:rPr>
+          <w:rFonts w:ascii="Avenir Next LT Pro Light" w:hAnsi="Avenir Next LT Pro Light" w:cstheme="minorHAnsi"/>
+        </w:rPr>
+        <w:t xml:space="preserve"> </w:t>
+      </w:r>
+      <w:r>
+        <w:rPr>
+          <w:rFonts w:ascii="Avenir Next LT Pro Light" w:hAnsi="Avenir Next LT Pro Light" w:cstheme="minorHAnsi"/>
+          <w:b/>
+        </w:rPr>
+        <w:t>€</w:t>
+      </w:r>
+      <w:r>
+        <w:rPr>
+          <w:rFonts w:ascii="Avenir Next LT Pro Light" w:hAnsi="Avenir Next LT Pro Light" w:cstheme="minorHAnsi"/>
+          <w:b/>
+        </w:rPr>
+        <w:t xml:space="preserve"> </w:t>
+      </w:r>
+      <w:r>
+        <w:rPr>
+          <w:rFonts w:ascii="Avenir Next LT Pro Light" w:hAnsi="Avenir Next LT Pro Light" w:cstheme="minorHAnsi"/>
+          <w:b/>
+        </w:rPr>
+        <w:t>[VALORE PERTINENZA]</w:t>
+      </w:r>
+      <w:r>
+        <w:rPr>
+          <w:rFonts w:ascii="Arial" w:eastAsia="Times New Roman" w:hAnsi="Arial" w:cs="Arial"/>
+          <w:sz w:val="20"/>
+          <w:szCs w:val="20"/>
+        </w:rPr>
+        <w:t/>
+      </w:r>
+      <w:r>
+        <w:rPr>
+          <w:rFonts w:ascii="Arial" w:eastAsia="Times New Roman" w:hAnsi="Arial" w:cs="Arial"/>
+          <w:sz w:val="20"/>
+          <w:szCs w:val="20"/>
+        </w:rPr>
+        <w:t/>
+      </w:r>
+    </w:p>
+    <w:p>
+      <w:pPr>
+        <w:ind w:left="2124" w:firstLine="708"/>
+        <w:rPr>
+          <w:rFonts w:ascii="Avenir Next LT Pro Light" w:hAnsi="Avenir Next LT Pro Light" w:cstheme="minorHAnsi"/>
+          <w:b/>
+        </w:rPr>
+      </w:pPr>
+      <w:r>
+        <w:rPr>
+          <w:rFonts w:ascii="Avenir Next LT Pro Light" w:hAnsi="Avenir Next LT Pro Light" w:cstheme="minorHAnsi"/>
+        </w:rPr>
+        <w:t xml:space="preserve">[FINE SE]</w:t>
+      </w:r>
+    </w:p>
+    <w:p>
+      <w:pPr>
+        <w:ind w:left="2124" w:firstLine="708"/>
+        <w:rPr>
+          <w:rFonts w:ascii="Avenir Next LT Pro Light" w:hAnsi="Avenir Next LT Pro Light" w:cstheme="minorHAnsi"/>
+          <w:b/>
+        </w:rPr>
+      </w:pPr>
     </w:p>
     <w:p>
       <w:pPr>
@@ -1781,6 +2152,21 @@
         <w:rPr>
           <w:rFonts w:ascii="Avenir Next LT Pro Light" w:hAnsi="Avenir Next LT Pro Light" w:cstheme="minorHAnsi"/>
         </w:rPr>
+        <w:t xml:space="preserve">[SE VETUSTA]</w:t>
+      </w:r>
+    </w:p>
+    <w:p>
+      <w:pPr>
+        <w:spacing w:line="360" w:lineRule="auto"/>
+        <w:jc w:val="both"/>
+        <w:rPr>
+          <w:rFonts w:ascii="Avenir Next LT Pro Light" w:hAnsi="Avenir Next LT Pro Light" w:cstheme="minorHAnsi"/>
+        </w:rPr>
+      </w:pPr>
+      <w:r>
+        <w:rPr>
+          <w:rFonts w:ascii="Avenir Next LT Pro Light" w:hAnsi="Avenir Next LT Pro Light" w:cstheme="minorHAnsi"/>
+        </w:rPr>
         <w:t xml:space="preserve">Il valore reale dell’immobile sarà dato dal valore a nuovo decurtato di un indice di vetustà del </w:t>
       </w:r>
       <w:r>
@@ -2073,9 +2459,70 @@
     <w:p>
       <w:pPr>
         <w:spacing w:line="360" w:lineRule="auto"/>
+        <w:ind w:left="-142"/>
+        <w:rPr>
+          <w:rFonts w:ascii="Avenir Next LT Pro Light" w:hAnsi="Avenir Next LT Pro Light" w:cstheme="minorHAnsi"/>
+          <w:b/>
+        </w:rPr>
+      </w:pPr>
+      <w:r>
+        <w:rPr>
+          <w:rFonts w:ascii="Avenir Next LT Pro Light" w:hAnsi="Avenir Next LT Pro Light" w:cstheme="minorHAnsi"/>
+        </w:rPr>
+        <w:t xml:space="preserve">[FINE SE]</w:t>
+      </w:r>
+    </w:p>
+    <w:p>
+      <w:pPr>
+        <w:spacing w:line="360" w:lineRule="auto"/>
         <w:jc w:val="both"/>
         <w:rPr>
           <w:rFonts w:ascii="Avenir Next LT Pro Light" w:hAnsi="Avenir Next LT Pro Light" w:cstheme="minorHAnsi"/>
+        </w:rPr>
+      </w:pPr>
+      <w:r>
+        <w:rPr>
+          <w:rFonts w:ascii="Avenir Next LT Pro Light" w:hAnsi="Avenir Next LT Pro Light" w:cstheme="minorHAnsi"/>
+        </w:rPr>
+        <w:t xml:space="preserve">[SE NON VETUSTA]</w:t>
+      </w:r>
+    </w:p>
+    <w:p>
+      <w:pPr>
+        <w:spacing w:line="360" w:lineRule="auto"/>
+        <w:jc w:val="both"/>
+        <w:rPr>
+          <w:rFonts w:ascii="Avenir Next LT Pro Light" w:hAnsi="Avenir Next LT Pro Light" w:cstheme="minorHAnsi"/>
+        </w:rPr>
+      </w:pPr>
+      <w:r>
+        <w:rPr>
+          <w:rFonts w:ascii="Avenir Next LT Pro Light" w:hAnsi="Avenir Next LT Pro Light" w:cstheme="minorHAnsi"/>
+        </w:rPr>
+        <w:t xml:space="preserve">Il valore reale dell’immobile sarà dato dal valore a nuovo decurtato di un indice di vetustà ricavato dai dati I.s.t.a.t. equivalenti alla media dell’età di costruzione dell’immobile e alle varie manutenzioni o rifacimenti di impianti idraulici/elettrici. Dato però il buono stato di manutenzione si è ritenuto di non applicare detto indice.</w:t>
+      </w:r>
+    </w:p>
+    <w:p>
+      <w:pPr>
+        <w:spacing w:line="360" w:lineRule="auto"/>
+        <w:jc w:val="both"/>
+        <w:rPr>
+          <w:rFonts w:ascii="Avenir Next LT Pro Light" w:hAnsi="Avenir Next LT Pro Light" w:cstheme="minorHAnsi"/>
+        </w:rPr>
+      </w:pPr>
+      <w:r>
+        <w:rPr>
+          <w:rFonts w:ascii="Avenir Next LT Pro Light" w:hAnsi="Avenir Next LT Pro Light" w:cstheme="minorHAnsi"/>
+        </w:rPr>
+        <w:t xml:space="preserve">[FINE SE]</w:t>
+      </w:r>
+    </w:p>
+    <w:p>
+      <w:pPr>
+        <w:spacing w:line="360" w:lineRule="auto"/>
+        <w:jc w:val="both"/>
+        <w:rPr>
+          <w:rFonts w:ascii="Avenir Next LT Pro Light" w:hAnsi="Avenir Next LT Pro Light" w:cstheme="minorHAnsi"/>
           <w:b/>
           <w:u w:val="single"/>
         </w:rPr>
@@ -2094,6 +2541,7 @@
     </w:p>
     <w:p>
       <w:pPr>
+        <w:keepNext/>
         <w:spacing w:line="360" w:lineRule="auto"/>
         <w:jc w:val="both"/>
         <w:rPr>
@@ -2171,7 +2619,7 @@
           <w:rFonts w:ascii="Avenir Next LT Pro Light" w:hAnsi="Avenir Next LT Pro Light" w:cstheme="minorHAnsi"/>
           <w:bCs/>
         </w:rPr>
-        <w:t>unicitàci</w:t>
+        <w:t>unicità ci</w:t>
       </w:r>
       <w:proofErr w:type="spellEnd"/>
       <w:r>
@@ -2179,7 +2627,7 @@
           <w:rFonts w:ascii="Avenir Next LT Pro Light" w:hAnsi="Avenir Next LT Pro Light" w:cstheme="minorHAnsi"/>
           <w:bCs/>
         </w:rPr>
-        <w:t xml:space="preserve"> permettono di proporre l’abitazione ad un valore commerciale aumentato del 10% rispetto al valore tecnico. L’ideale punto di partenza, pertanto, sarebbe un valore di €</w:t>
+        <w:t xml:space="preserve"> permettono di proporre l’abitazione ad un valore commerciale aumentato del [AUMENTO COMMERCIALE]% rispetto al valore tecnico. L’ideale punto di partenza, pertanto, sarebbe un valore di €</w:t>
       </w:r>
       <w:r>
         <w:rPr>
@@ -2202,6 +2650,7 @@
     </w:p>
     <w:p>
       <w:pPr>
+        <w:keepNext/>
         <w:spacing w:line="360" w:lineRule="auto"/>
         <w:jc w:val="both"/>
         <w:rPr>
@@ -2269,6 +2718,7 @@
     </w:p>
     <w:p>
       <w:pPr>
+        <w:keepNext/>
         <w:spacing w:line="360" w:lineRule="auto"/>
         <w:jc w:val="both"/>
         <w:rPr>

</xml_diff>

<commit_message>
Firma dall'Excel e zona OMI anche per nome
- Excel: cella FIRMA (E6/F6) e nota sulla cella della zona OMI
- Word: [FIRMA] in fondo, a destra in corsivo
- zona OMI indicabile col codice (B1) o col nome della zona come sul sito;
  se il nome corrisponde a più zone vengono elencate invece di sceglierne una

Co-Authored-By: Claude Opus 5.5 <noreply@anthropic.com>
Claude-Session: https://claude.ai/code/session_01GFqWfsVatsLJvctcKSGrA2
</commit_message>
<xml_diff>
--- a/valutazioni/modelli/valutazione_modello.docx
+++ b/valutazioni/modelli/valutazione_modello.docx
@@ -2882,6 +2882,31 @@
           <w:rFonts w:ascii="Avenir Next LT Pro Light" w:hAnsi="Avenir Next LT Pro Light" w:cstheme="minorHAnsi"/>
         </w:rPr>
         <w:t>Ringraziandovi per l’attenzione accordataci porgiamo distinti saluti.</w:t>
+      </w:r>
+    </w:p>
+    <w:p>
+      <w:pPr>
+        <w:spacing w:line="360" w:lineRule="auto"/>
+        <w:jc w:val="both"/>
+        <w:rPr>
+          <w:rFonts w:ascii="Avenir Next LT Pro Light" w:hAnsi="Avenir Next LT Pro Light" w:cstheme="minorHAnsi"/>
+        </w:rPr>
+      </w:pPr>
+    </w:p>
+    <w:p>
+      <w:pPr>
+        <w:spacing w:line="360" w:lineRule="auto"/>
+        <w:jc w:val="right"/>
+        <w:rPr>
+          <w:rFonts w:ascii="Avenir Next LT Pro Light" w:hAnsi="Avenir Next LT Pro Light" w:cstheme="minorHAnsi"/>
+        </w:rPr>
+      </w:pPr>
+      <w:r>
+        <w:rPr>
+          <w:rFonts w:ascii="Avenir Next LT Pro Light" w:hAnsi="Avenir Next LT Pro Light" w:cstheme="minorHAnsi"/>
+          <w:i/>
+        </w:rPr>
+        <w:t xml:space="preserve">[FIRMA]</w:t>
       </w:r>
     </w:p>
     <w:p>

</xml_diff>